<commit_message>
Feat: adicionado a documentação final
</commit_message>
<xml_diff>
--- a/projeto/documentos/Documentação Skate.log.docx
+++ b/projeto/documentos/Documentação Skate.log.docx
@@ -402,6 +402,13 @@
     </w:p>
     <w:sdt>
       <w:sdtPr>
+        <w:rPr>
+          <w:rFonts w:asciiTheme="minorHAnsi" w:eastAsiaTheme="minorHAnsi" w:hAnsiTheme="minorHAnsi" w:cstheme="minorBidi"/>
+          <w:color w:val="auto"/>
+          <w:sz w:val="24"/>
+          <w:szCs w:val="24"/>
+          <w:lang w:eastAsia="en-US"/>
+        </w:rPr>
         <w:id w:val="-1335918420"/>
         <w:docPartObj>
           <w:docPartGallery w:val="Table of Contents"/>
@@ -410,13 +417,8 @@
       </w:sdtPr>
       <w:sdtEndPr>
         <w:rPr>
-          <w:rFonts w:asciiTheme="minorHAnsi" w:eastAsiaTheme="minorHAnsi" w:hAnsiTheme="minorHAnsi" w:cstheme="minorBidi"/>
           <w:b/>
           <w:bCs/>
-          <w:color w:val="auto"/>
-          <w:sz w:val="24"/>
-          <w:szCs w:val="24"/>
-          <w:lang w:eastAsia="en-US"/>
         </w:rPr>
       </w:sdtEndPr>
       <w:sdtContent>
@@ -1763,7 +1765,19 @@
         <w:jc w:val="both"/>
       </w:pPr>
       <w:r>
-        <w:t xml:space="preserve">O objetivo deste projeto é desenvolver um site institucional sobre a cena do skate até o final do </w:t>
+        <w:t xml:space="preserve">O objetivo deste projeto é desenvolver um site </w:t>
+      </w:r>
+      <w:r>
+        <w:t>para cadastro de manobras</w:t>
+      </w:r>
+      <w:r>
+        <w:t xml:space="preserve"> de</w:t>
+      </w:r>
+      <w:r>
+        <w:t xml:space="preserve"> </w:t>
+      </w:r>
+      <w:r>
+        <w:t xml:space="preserve">skate até o final do </w:t>
       </w:r>
       <w:r>
         <w:t>primeiro</w:t>
@@ -1963,19 +1977,76 @@
         <w:jc w:val="both"/>
       </w:pPr>
       <w:r>
-        <w:t>A relevância deste projeto justifica-se pela união rara entre o domínio técnico da tecnologia e a autoridade de quem vivencia a cultura que está sendo digitalizada. Este site de skate, equipado com dashboards de análise de desempenho e dados da cena local, nasce não apenas como uma ferramenta técnica, mas como uma extensão de uma vivência pessoal profunda.</w:t>
+        <w:t xml:space="preserve">A relevância deste projeto justifica-se pela união rara entre o domínio técnico da tecnologia e a autoridade de quem vivencia a cultura que está sendo digitalizada. Este site de skate, equipado com dashboards de análise de </w:t>
+      </w:r>
+      <w:r>
+        <w:t>frequência</w:t>
+      </w:r>
+      <w:r>
+        <w:t xml:space="preserve"> e dados da</w:t>
+      </w:r>
+      <w:r>
+        <w:t>s sessões realizadas</w:t>
+      </w:r>
+      <w:r>
+        <w:t>, nasce não apenas como uma ferramenta técnica, mas como uma extensão de uma vivência pessoal profunda.</w:t>
       </w:r>
       <w:r>
         <w:t xml:space="preserve"> </w:t>
       </w:r>
       <w:r>
-        <w:t>Ao contrário de interfaces genéricas, este desenvolvimento é pautado por uma compreensão empática das necessidades da comunidade. A motivação central para este trabalho reside no papel transformador que o skate desempenhou em minha trajetória; durante o período crítico da pandemia, o esporte foi o alicerce que me ajudou a superar momentos de vulnerabilidade mental e isolamento, proporcionando foco e equilíbrio.</w:t>
+        <w:t xml:space="preserve">Ao contrário de interfaces genéricas, este desenvolvimento é pautado por </w:t>
+      </w:r>
+      <w:r>
+        <w:t xml:space="preserve">reconhecer </w:t>
+      </w:r>
+      <w:r>
+        <w:t xml:space="preserve">as necessidades da comunidade. A motivação central para este trabalho reside no papel </w:t>
+      </w:r>
+      <w:r>
+        <w:t>libertador</w:t>
+      </w:r>
+      <w:r>
+        <w:t xml:space="preserve"> que o skate </w:t>
+      </w:r>
+      <w:r>
+        <w:t>fez</w:t>
+      </w:r>
+      <w:r>
+        <w:t xml:space="preserve"> em minha trajetória; durante o período crítico da pandemia, o esporte foi o </w:t>
+      </w:r>
+      <w:r>
+        <w:t xml:space="preserve">principal </w:t>
+      </w:r>
+      <w:r>
+        <w:t>meio</w:t>
+      </w:r>
+      <w:r>
+        <w:t xml:space="preserve"> que me ajudou a superar momentos de vulnerabilidade mental e isolamento, proporcionando foco e equilíbrio.</w:t>
       </w:r>
       <w:r>
         <w:t xml:space="preserve"> </w:t>
       </w:r>
       <w:r>
-        <w:t>Dessa forma, o projeto fundamenta-se na simbiose entre a mentalidade do skatista e a do desenvolvedor: a resiliência necessária para persistir em uma manobra após sucessivas quedas é o mesmo motor que impulsiona a resolução de problemas complexos de código, a estruturação de dados em dashboards precisos e a busca pela excelência técnica. Desenvolver este site é, acima de tudo, uma forma de retribuir à cultura que me ensinou sobre superação, oferecendo um produto que não apenas funciona com rigor estatístico, mas que possui alma, identidade e um propósito claro de fortalecer a cena através da tecnologia.</w:t>
+        <w:t>Dessa forma, o projeto fundamenta-se na simbiose entre a mentalidade do skatista e a do desenvolvedor</w:t>
+      </w:r>
+      <w:r>
+        <w:t xml:space="preserve">, </w:t>
+      </w:r>
+      <w:r>
+        <w:t xml:space="preserve">a </w:t>
+      </w:r>
+      <w:r>
+        <w:t>determinação</w:t>
+      </w:r>
+      <w:r>
+        <w:t xml:space="preserve"> necessária para persistir em uma manobra após sucessivas quedas </w:t>
+      </w:r>
+      <w:r>
+        <w:t>e</w:t>
+      </w:r>
+      <w:r>
+        <w:t xml:space="preserve"> a resolução de problemas complexos de código, a estruturação de dados em dashboards precisos e a busca pela excelência técnica. Desenvolver este site é, acima de tudo, uma forma de retribuir à cultura que me ensinou sobre superação, oferecendo um produto que não apenas funciona com rigor estatístico, mas que possui alma, identidade e um propósito claro de fortalecer a cena através da tecnologia.</w:t>
       </w:r>
     </w:p>
     <w:p>
@@ -2061,7 +2132,31 @@
       </w:pPr>
       <w:r>
         <w:tab/>
-        <w:t>O projeto consiste no desenvolvimento de uma plataforma web interativa dedicada à cultura do skate, servindo como um espaço de convergência entre a narrativa pessoal do autor e uma ferramenta funcional para entusiastas. O site apresentará uma interface pública focada na história e filosofia do esporte como ferramenta de resiliência, além de uma área restrita (autenticada) com dashboards para gestão de progresso e interação da comunidade. </w:t>
+        <w:t xml:space="preserve">O projeto consiste no desenvolvimento de uma plataforma web interativa dedicada à cultura do skate, servindo como um espaço de convergência entre a narrativa pessoal </w:t>
+      </w:r>
+      <w:r>
+        <w:t>do autor</w:t>
+      </w:r>
+      <w:r>
+        <w:t xml:space="preserve"> e uma ferramenta funcional para </w:t>
+      </w:r>
+      <w:r>
+        <w:t>amantes do esporte</w:t>
+      </w:r>
+      <w:r>
+        <w:t xml:space="preserve">. O site apresentará uma interface pública focada na </w:t>
+      </w:r>
+      <w:r>
+        <w:t>estética urbana</w:t>
+      </w:r>
+      <w:r>
+        <w:t xml:space="preserve"> do esporte, além de uma área restrita (autenticada) com dashboards para gestão de progresso e </w:t>
+      </w:r>
+      <w:r>
+        <w:t>cadastro de treinos</w:t>
+      </w:r>
+      <w:r>
+        <w:t>. </w:t>
       </w:r>
     </w:p>
     <w:p>
@@ -2186,6 +2281,23 @@
       <w:bookmarkEnd w:id="5"/>
       <w:r>
         <w:t> </w:t>
+      </w:r>
+    </w:p>
+    <w:p>
+      <w:r>
+        <w:t>Espera-se que o Skate.log se consolide como uma ferramenta funcional e intuitiva, capaz de transformar o registro rotineiro de sessões de skate em um histórico estratégico de evolução técnica. O principal resultado pretendido é a entrega de um ambiente seguro, onde o sistema de autenticação garanta a integridade do perfil do usuário e a persistência de seus dados</w:t>
+      </w:r>
+      <w:r>
+        <w:t>, que estarão em um ambiente virtual</w:t>
+      </w:r>
+      <w:r>
+        <w:t xml:space="preserve">. No aspecto prático, projeta-se que o dashboard interativo forneça uma interpretação clara do desempenho do skatista, permitindo a identificação de padrões, como o aumento da frequência de treinos ou a </w:t>
+      </w:r>
+      <w:r>
+        <w:t>persistência</w:t>
+      </w:r>
+      <w:r>
+        <w:t xml:space="preserve"> em manobras específicas, através de visualizações gráficas dinâmicas.</w:t>
       </w:r>
     </w:p>
     <w:p>
@@ -2302,42 +2414,6 @@
     </w:p>
     <w:p>
       <w:pPr>
-        <w:spacing w:line="360" w:lineRule="auto"/>
-        <w:jc w:val="both"/>
-      </w:pPr>
-    </w:p>
-    <w:p>
-      <w:pPr>
-        <w:spacing w:line="360" w:lineRule="auto"/>
-        <w:jc w:val="both"/>
-      </w:pPr>
-    </w:p>
-    <w:p>
-      <w:pPr>
-        <w:spacing w:line="360" w:lineRule="auto"/>
-        <w:jc w:val="both"/>
-      </w:pPr>
-    </w:p>
-    <w:p>
-      <w:pPr>
-        <w:spacing w:line="360" w:lineRule="auto"/>
-        <w:jc w:val="both"/>
-      </w:pPr>
-    </w:p>
-    <w:p>
-      <w:pPr>
-        <w:spacing w:line="360" w:lineRule="auto"/>
-        <w:jc w:val="both"/>
-      </w:pPr>
-    </w:p>
-    <w:p>
-      <w:pPr>
-        <w:spacing w:line="360" w:lineRule="auto"/>
-        <w:jc w:val="both"/>
-      </w:pPr>
-    </w:p>
-    <w:p>
-      <w:pPr>
         <w:pStyle w:val="Ttulo2"/>
       </w:pPr>
       <w:r>
@@ -2362,606 +2438,720 @@
       </w:pPr>
       <w:r>
         <w:tab/>
-        <w:t>Os requisitos funcionais do sistema incluem a capacidade de realizar cadastros de novos usuários, recuperação de credenciais e a exibição de dados estatísticos personalizados em dashboards individuais. No que tange aos requisitos não funcionais, a plataforma deve ser prioritariamente responsiva, seguindo a filosofia Mobile-</w:t>
+        <w:t xml:space="preserve">Os requisitos funcionais do sistema incluem a capacidade de realizar cadastros de novos usuários, a exibição de dados personalizados em dashboards </w:t>
+      </w:r>
+      <w:r>
+        <w:t>e KPIs</w:t>
+      </w:r>
+      <w:r>
+        <w:t xml:space="preserve">. No que tange aos requisitos não funcionais, a plataforma deve ser prioritariamente </w:t>
+      </w:r>
+      <w:r>
+        <w:t>responsiva, e</w:t>
+      </w:r>
+      <w:r>
+        <w:t xml:space="preserve"> garantir a segurança absoluta dos dados sensíveis por meio d</w:t>
+      </w:r>
+      <w:r>
+        <w:t>o banco de dados estando em um ambiente virtual</w:t>
+      </w:r>
+      <w:r>
+        <w:t>. O design de interface deve ser rigorosamente alinhado à estética urbana do skate, garantindo que a usabilidade e a acessibilidade sejam mantidas sem comprometer a identidade visual do projeto. </w:t>
+      </w:r>
+    </w:p>
+    <w:p>
+      <w:pPr>
+        <w:spacing w:line="360" w:lineRule="auto"/>
+        <w:jc w:val="both"/>
+      </w:pPr>
+      <w:r>
+        <w:t> </w:t>
+      </w:r>
+    </w:p>
+    <w:p>
+      <w:pPr>
+        <w:spacing w:line="360" w:lineRule="auto"/>
+        <w:jc w:val="both"/>
+      </w:pPr>
+    </w:p>
+    <w:p>
+      <w:pPr>
+        <w:spacing w:line="360" w:lineRule="auto"/>
+        <w:jc w:val="both"/>
+      </w:pPr>
+    </w:p>
+    <w:p>
+      <w:pPr>
+        <w:spacing w:line="360" w:lineRule="auto"/>
+        <w:jc w:val="both"/>
+      </w:pPr>
+    </w:p>
+    <w:p>
+      <w:pPr>
+        <w:spacing w:line="360" w:lineRule="auto"/>
+        <w:jc w:val="both"/>
+      </w:pPr>
+    </w:p>
+    <w:p>
+      <w:pPr>
+        <w:spacing w:line="360" w:lineRule="auto"/>
+        <w:jc w:val="both"/>
+      </w:pPr>
+    </w:p>
+    <w:p>
+      <w:pPr>
+        <w:spacing w:line="360" w:lineRule="auto"/>
+        <w:jc w:val="both"/>
+      </w:pPr>
+    </w:p>
+    <w:p>
+      <w:pPr>
+        <w:spacing w:line="360" w:lineRule="auto"/>
+        <w:jc w:val="both"/>
+      </w:pPr>
+    </w:p>
+    <w:p>
+      <w:pPr>
+        <w:spacing w:line="360" w:lineRule="auto"/>
+        <w:jc w:val="both"/>
+      </w:pPr>
+    </w:p>
+    <w:p>
+      <w:pPr>
+        <w:spacing w:line="360" w:lineRule="auto"/>
+        <w:jc w:val="both"/>
+      </w:pPr>
+    </w:p>
+    <w:p>
+      <w:pPr>
+        <w:spacing w:line="360" w:lineRule="auto"/>
+        <w:jc w:val="both"/>
+      </w:pPr>
+    </w:p>
+    <w:p>
+      <w:pPr>
+        <w:spacing w:line="360" w:lineRule="auto"/>
+        <w:jc w:val="both"/>
+      </w:pPr>
+    </w:p>
+    <w:p>
+      <w:pPr>
+        <w:spacing w:line="360" w:lineRule="auto"/>
+        <w:jc w:val="both"/>
+      </w:pPr>
+    </w:p>
+    <w:p>
+      <w:pPr>
+        <w:spacing w:line="360" w:lineRule="auto"/>
+        <w:jc w:val="both"/>
+      </w:pPr>
+    </w:p>
+    <w:p>
+      <w:pPr>
+        <w:spacing w:line="360" w:lineRule="auto"/>
+        <w:jc w:val="both"/>
+      </w:pPr>
+    </w:p>
+    <w:p>
+      <w:pPr>
+        <w:spacing w:line="360" w:lineRule="auto"/>
+        <w:jc w:val="both"/>
+      </w:pPr>
+    </w:p>
+    <w:p>
+      <w:pPr>
+        <w:spacing w:line="360" w:lineRule="auto"/>
+        <w:jc w:val="both"/>
+      </w:pPr>
+    </w:p>
+    <w:p>
+      <w:pPr>
+        <w:pStyle w:val="Ttulo2"/>
+      </w:pPr>
+      <w:r>
+        <w:t>        </w:t>
+      </w:r>
+      <w:bookmarkStart w:id="7" w:name="_Toc227570279"/>
+      <w:r>
+        <w:t>4.4</w:t>
+      </w:r>
+      <w:r>
+        <w:t>LIMITES E EXCLUSÕES</w:t>
+      </w:r>
+      <w:bookmarkEnd w:id="7"/>
+      <w:r>
+        <w:t> </w:t>
+      </w:r>
+    </w:p>
+    <w:p>
+      <w:pPr>
+        <w:spacing w:line="360" w:lineRule="auto"/>
+        <w:jc w:val="both"/>
+      </w:pPr>
+      <w:r>
+        <w:tab/>
+        <w:t>Embora o projeto busque ser abrangente, ele possui limites claros, não contemplando funcionalidades de e-commerce ou venda direta de produtos nesta fase inicial. Também estão excluídos o suporte para streaming de vídeo em tempo real e a hospedagem de arquivos pesados em servidores próprios, optando-se por provedores externos para tal fim. A plataforma será disponibilizada inicialmente apenas em português, não prevendo traduções para outros idiomas ou suporte para funcionalidades complexas de redes sociais externas além das integrações básicas de compartilhamento. </w:t>
+      </w:r>
+    </w:p>
+    <w:p>
+      <w:pPr>
+        <w:spacing w:line="360" w:lineRule="auto"/>
+        <w:jc w:val="both"/>
+      </w:pPr>
+      <w:r>
+        <w:t>      </w:t>
+      </w:r>
+    </w:p>
+    <w:p>
+      <w:pPr>
+        <w:spacing w:line="360" w:lineRule="auto"/>
+        <w:jc w:val="both"/>
+      </w:pPr>
+    </w:p>
+    <w:p>
+      <w:pPr>
+        <w:spacing w:line="360" w:lineRule="auto"/>
+        <w:jc w:val="both"/>
+      </w:pPr>
+    </w:p>
+    <w:p>
+      <w:pPr>
+        <w:spacing w:line="360" w:lineRule="auto"/>
+        <w:jc w:val="both"/>
+      </w:pPr>
+    </w:p>
+    <w:p>
+      <w:pPr>
+        <w:spacing w:line="360" w:lineRule="auto"/>
+        <w:jc w:val="both"/>
+      </w:pPr>
+    </w:p>
+    <w:p>
+      <w:pPr>
+        <w:spacing w:line="360" w:lineRule="auto"/>
+        <w:jc w:val="both"/>
+      </w:pPr>
+    </w:p>
+    <w:p>
+      <w:pPr>
+        <w:spacing w:line="360" w:lineRule="auto"/>
+        <w:jc w:val="both"/>
+      </w:pPr>
+    </w:p>
+    <w:p>
+      <w:pPr>
+        <w:spacing w:line="360" w:lineRule="auto"/>
+        <w:jc w:val="both"/>
+      </w:pPr>
+    </w:p>
+    <w:p>
+      <w:pPr>
+        <w:spacing w:line="360" w:lineRule="auto"/>
+        <w:jc w:val="both"/>
+      </w:pPr>
+    </w:p>
+    <w:p>
+      <w:pPr>
+        <w:spacing w:line="360" w:lineRule="auto"/>
+        <w:jc w:val="both"/>
+      </w:pPr>
+    </w:p>
+    <w:p>
+      <w:pPr>
+        <w:spacing w:line="360" w:lineRule="auto"/>
+        <w:jc w:val="both"/>
+      </w:pPr>
+    </w:p>
+    <w:p>
+      <w:pPr>
+        <w:spacing w:line="360" w:lineRule="auto"/>
+        <w:jc w:val="both"/>
+      </w:pPr>
+    </w:p>
+    <w:p>
+      <w:pPr>
+        <w:spacing w:line="360" w:lineRule="auto"/>
+        <w:jc w:val="both"/>
+      </w:pPr>
+    </w:p>
+    <w:p>
+      <w:pPr>
+        <w:spacing w:line="360" w:lineRule="auto"/>
+        <w:jc w:val="both"/>
+      </w:pPr>
+    </w:p>
+    <w:p>
+      <w:pPr>
+        <w:spacing w:line="360" w:lineRule="auto"/>
+        <w:jc w:val="both"/>
+      </w:pPr>
+    </w:p>
+    <w:p>
+      <w:pPr>
+        <w:spacing w:line="360" w:lineRule="auto"/>
+        <w:jc w:val="both"/>
+      </w:pPr>
+      <w:r>
+        <w:t>   </w:t>
+      </w:r>
+    </w:p>
+    <w:p>
+      <w:pPr>
+        <w:spacing w:line="360" w:lineRule="auto"/>
+        <w:jc w:val="both"/>
+      </w:pPr>
+    </w:p>
+    <w:p>
+      <w:pPr>
+        <w:pStyle w:val="Ttulo2"/>
+      </w:pPr>
+      <w:bookmarkStart w:id="8" w:name="_Toc227570280"/>
+      <w:r>
+        <w:t>4.5</w:t>
+      </w:r>
+      <w:r>
+        <w:t>MACRO CRONOGRAMA</w:t>
+      </w:r>
+      <w:bookmarkEnd w:id="8"/>
+      <w:r>
+        <w:t> </w:t>
+      </w:r>
+    </w:p>
+    <w:p>
+      <w:r>
+        <w:t>Começo projeto: semana 1</w:t>
+      </w:r>
+    </w:p>
+    <w:p>
+      <w:r>
+        <w:t>Tema definido + documentação + ferramenta de gestão: semana 2</w:t>
+      </w:r>
+    </w:p>
+    <w:p>
+      <w:r>
+        <w:t>Tela home</w:t>
+      </w:r>
+      <w:r>
+        <w:t>: semana 3</w:t>
+      </w:r>
+    </w:p>
+    <w:p>
+      <w:r>
+        <w:t>Tela cadastro e login: semana 4</w:t>
+      </w:r>
+    </w:p>
+    <w:p>
+      <w:r>
+        <w:t>Dashboard: semana 5</w:t>
+      </w:r>
+    </w:p>
+    <w:p>
+      <w:r>
+        <w:t>Slide para apresentação: semana 6</w:t>
+      </w:r>
+    </w:p>
+    <w:p/>
+    <w:p/>
+    <w:p>
+      <w:pPr>
+        <w:spacing w:line="360" w:lineRule="auto"/>
+        <w:jc w:val="both"/>
+      </w:pPr>
+      <w:r>
+        <w:t>       </w:t>
+      </w:r>
+    </w:p>
+    <w:p>
+      <w:pPr>
+        <w:spacing w:line="360" w:lineRule="auto"/>
+        <w:jc w:val="both"/>
+      </w:pPr>
+    </w:p>
+    <w:p>
+      <w:pPr>
+        <w:spacing w:line="360" w:lineRule="auto"/>
+        <w:jc w:val="both"/>
+      </w:pPr>
+    </w:p>
+    <w:p>
+      <w:pPr>
+        <w:spacing w:line="360" w:lineRule="auto"/>
+        <w:jc w:val="both"/>
+      </w:pPr>
+    </w:p>
+    <w:p>
+      <w:pPr>
+        <w:spacing w:line="360" w:lineRule="auto"/>
+        <w:jc w:val="both"/>
+      </w:pPr>
+    </w:p>
+    <w:p>
+      <w:pPr>
+        <w:spacing w:line="360" w:lineRule="auto"/>
+        <w:jc w:val="both"/>
+      </w:pPr>
+    </w:p>
+    <w:p>
+      <w:pPr>
+        <w:spacing w:line="360" w:lineRule="auto"/>
+        <w:jc w:val="both"/>
+      </w:pPr>
+    </w:p>
+    <w:p>
+      <w:pPr>
+        <w:spacing w:line="360" w:lineRule="auto"/>
+        <w:jc w:val="both"/>
+      </w:pPr>
+    </w:p>
+    <w:p>
+      <w:pPr>
+        <w:spacing w:line="360" w:lineRule="auto"/>
+        <w:jc w:val="both"/>
+      </w:pPr>
+    </w:p>
+    <w:p>
+      <w:pPr>
+        <w:spacing w:line="360" w:lineRule="auto"/>
+        <w:jc w:val="both"/>
+      </w:pPr>
+    </w:p>
+    <w:p>
+      <w:pPr>
+        <w:spacing w:line="360" w:lineRule="auto"/>
+        <w:jc w:val="both"/>
+      </w:pPr>
+    </w:p>
+    <w:p>
+      <w:pPr>
+        <w:spacing w:line="360" w:lineRule="auto"/>
+        <w:jc w:val="both"/>
+      </w:pPr>
+    </w:p>
+    <w:p>
+      <w:pPr>
+        <w:spacing w:line="360" w:lineRule="auto"/>
+        <w:jc w:val="both"/>
+      </w:pPr>
+    </w:p>
+    <w:p>
+      <w:pPr>
+        <w:spacing w:line="360" w:lineRule="auto"/>
+        <w:jc w:val="both"/>
+      </w:pPr>
+    </w:p>
+    <w:p>
+      <w:pPr>
+        <w:spacing w:line="360" w:lineRule="auto"/>
+        <w:jc w:val="both"/>
+      </w:pPr>
+      <w:r>
+        <w:t> </w:t>
+      </w:r>
+    </w:p>
+    <w:p>
+      <w:pPr>
+        <w:pStyle w:val="Ttulo2"/>
+      </w:pPr>
+      <w:bookmarkStart w:id="9" w:name="_Toc227570281"/>
+      <w:r>
+        <w:lastRenderedPageBreak/>
+        <w:t>4.6</w:t>
+      </w:r>
+      <w:r>
+        <w:t>RECURSOS</w:t>
+      </w:r>
+      <w:bookmarkEnd w:id="9"/>
+      <w:r>
+        <w:t> </w:t>
+      </w:r>
+    </w:p>
+    <w:p>
+      <w:pPr>
+        <w:spacing w:line="360" w:lineRule="auto"/>
+        <w:jc w:val="both"/>
+      </w:pPr>
+      <w:r>
+        <w:tab/>
+        <w:t xml:space="preserve">Para a execução do projeto, os recursos humanos serão centralizados no autor, atuando como desenvolvedor Full Stack em todas as frentes. No âmbito tecnológico, serão utilizados </w:t>
+      </w:r>
+      <w:r>
+        <w:t xml:space="preserve">HTML, </w:t>
       </w:r>
       <w:proofErr w:type="spellStart"/>
       <w:r>
-        <w:t>First</w:t>
+        <w:t>JavaScript</w:t>
       </w:r>
       <w:proofErr w:type="spellEnd"/>
       <w:r>
-        <w:t>, e garantir a segurança absoluta dos dados sensíveis por meio de criptografia. O design de interface deve ser rigorosamente alinhado à estética urbana do skate, garantindo que a usabilidade e a acessibilidade sejam mantidas sem comprometer a identidade visual do projeto. </w:t>
-      </w:r>
-    </w:p>
-    <w:p>
-      <w:pPr>
-        <w:spacing w:line="360" w:lineRule="auto"/>
-        <w:jc w:val="both"/>
-      </w:pPr>
+        <w:t xml:space="preserve">, CSS, </w:t>
+      </w:r>
+      <w:r>
+        <w:t>junto com a API Web Data-</w:t>
+      </w:r>
+      <w:proofErr w:type="spellStart"/>
+      <w:r>
+        <w:t>Viz</w:t>
+      </w:r>
+      <w:proofErr w:type="spellEnd"/>
+      <w:r>
+        <w:t xml:space="preserve"> disponibilizada pela instituição de ensino </w:t>
+      </w:r>
+      <w:proofErr w:type="spellStart"/>
+      <w:r>
+        <w:t>SpTech</w:t>
+      </w:r>
+      <w:proofErr w:type="spellEnd"/>
+      <w:r>
+        <w:t>, além de</w:t>
+      </w:r>
+      <w:r>
+        <w:t xml:space="preserve"> </w:t>
+      </w:r>
+      <w:r>
+        <w:t>um</w:t>
+      </w:r>
+      <w:r>
+        <w:t xml:space="preserve"> banco</w:t>
+      </w:r>
+      <w:r>
+        <w:t xml:space="preserve"> de dados</w:t>
+      </w:r>
+      <w:r>
+        <w:t xml:space="preserve"> em um ambiente</w:t>
+      </w:r>
+      <w:r>
+        <w:t xml:space="preserve"> </w:t>
+      </w:r>
+      <w:r>
+        <w:t xml:space="preserve">virtual de sistema </w:t>
+      </w:r>
+      <w:proofErr w:type="spellStart"/>
+      <w:r>
+        <w:t>Lubuntu</w:t>
+      </w:r>
+      <w:proofErr w:type="spellEnd"/>
+      <w:r>
+        <w:t xml:space="preserve"> e ferramentas de design como o </w:t>
+      </w:r>
+      <w:proofErr w:type="spellStart"/>
+      <w:r>
+        <w:t>Figma</w:t>
+      </w:r>
+      <w:proofErr w:type="spellEnd"/>
+      <w:r>
+        <w:t>,</w:t>
+      </w:r>
+      <w:r>
+        <w:t xml:space="preserve"> além das ferramentas de gestão como </w:t>
+      </w:r>
+      <w:proofErr w:type="spellStart"/>
+      <w:r>
+        <w:t>trello</w:t>
+      </w:r>
+      <w:proofErr w:type="spellEnd"/>
+      <w:r>
+        <w:t xml:space="preserve"> e github</w:t>
+      </w:r>
+      <w:r>
+        <w:t xml:space="preserve"> priorizando soluções que ofereçam escalabilidade e estabilidade para o </w:t>
+      </w:r>
+      <w:proofErr w:type="gramStart"/>
+      <w:r>
+        <w:t>produto final</w:t>
+      </w:r>
+      <w:proofErr w:type="gramEnd"/>
+      <w:r>
+        <w:t>. </w:t>
+      </w:r>
+    </w:p>
+    <w:p>
+      <w:pPr>
+        <w:spacing w:line="360" w:lineRule="auto"/>
+        <w:jc w:val="both"/>
+      </w:pPr>
+      <w:r>
+        <w:t>    </w:t>
+      </w:r>
+    </w:p>
+    <w:p>
+      <w:pPr>
+        <w:spacing w:line="360" w:lineRule="auto"/>
+        <w:jc w:val="both"/>
+      </w:pPr>
+    </w:p>
+    <w:p>
+      <w:pPr>
+        <w:spacing w:line="360" w:lineRule="auto"/>
+        <w:jc w:val="both"/>
+      </w:pPr>
+    </w:p>
+    <w:p>
+      <w:pPr>
+        <w:spacing w:line="360" w:lineRule="auto"/>
+        <w:jc w:val="both"/>
+      </w:pPr>
+    </w:p>
+    <w:p>
+      <w:pPr>
+        <w:spacing w:line="360" w:lineRule="auto"/>
+        <w:jc w:val="both"/>
+      </w:pPr>
+    </w:p>
+    <w:p>
+      <w:pPr>
+        <w:spacing w:line="360" w:lineRule="auto"/>
+        <w:jc w:val="both"/>
+      </w:pPr>
+    </w:p>
+    <w:p>
+      <w:pPr>
+        <w:spacing w:line="360" w:lineRule="auto"/>
+        <w:jc w:val="both"/>
+      </w:pPr>
+    </w:p>
+    <w:p>
+      <w:pPr>
+        <w:spacing w:line="360" w:lineRule="auto"/>
+        <w:jc w:val="both"/>
+      </w:pPr>
+    </w:p>
+    <w:p>
+      <w:pPr>
+        <w:spacing w:line="360" w:lineRule="auto"/>
+        <w:jc w:val="both"/>
+      </w:pPr>
+    </w:p>
+    <w:p>
+      <w:pPr>
+        <w:spacing w:line="360" w:lineRule="auto"/>
+        <w:jc w:val="both"/>
+      </w:pPr>
+    </w:p>
+    <w:p>
+      <w:pPr>
+        <w:spacing w:line="360" w:lineRule="auto"/>
+        <w:jc w:val="both"/>
+      </w:pPr>
+    </w:p>
+    <w:p>
+      <w:pPr>
+        <w:spacing w:line="360" w:lineRule="auto"/>
+        <w:jc w:val="both"/>
+      </w:pPr>
+    </w:p>
+    <w:p>
+      <w:pPr>
+        <w:spacing w:line="360" w:lineRule="auto"/>
+        <w:jc w:val="both"/>
+      </w:pPr>
+    </w:p>
+    <w:p>
+      <w:pPr>
+        <w:spacing w:line="360" w:lineRule="auto"/>
+        <w:jc w:val="both"/>
+      </w:pPr>
+    </w:p>
+    <w:p>
+      <w:pPr>
+        <w:spacing w:line="360" w:lineRule="auto"/>
+        <w:jc w:val="both"/>
+      </w:pPr>
+    </w:p>
+    <w:p>
+      <w:pPr>
+        <w:spacing w:line="360" w:lineRule="auto"/>
+        <w:jc w:val="both"/>
+      </w:pPr>
+    </w:p>
+    <w:p>
+      <w:pPr>
+        <w:spacing w:line="360" w:lineRule="auto"/>
+        <w:jc w:val="both"/>
+      </w:pPr>
+    </w:p>
+    <w:p>
+      <w:pPr>
+        <w:pStyle w:val="Ttulo2"/>
+      </w:pPr>
+      <w:r>
+        <w:lastRenderedPageBreak/>
+        <w:t>     </w:t>
+      </w:r>
+      <w:bookmarkStart w:id="10" w:name="_Toc227570282"/>
+      <w:r>
+        <w:t>4.7</w:t>
+      </w:r>
+      <w:r>
+        <w:t>RISCOS E RESTRIÇÕES</w:t>
+      </w:r>
+      <w:bookmarkEnd w:id="10"/>
       <w:r>
         <w:t> </w:t>
       </w:r>
     </w:p>
     <w:p>
-      <w:pPr>
-        <w:spacing w:line="360" w:lineRule="auto"/>
-        <w:jc w:val="both"/>
-      </w:pPr>
-    </w:p>
-    <w:p>
-      <w:pPr>
-        <w:spacing w:line="360" w:lineRule="auto"/>
-        <w:jc w:val="both"/>
-      </w:pPr>
-    </w:p>
-    <w:p>
-      <w:pPr>
-        <w:spacing w:line="360" w:lineRule="auto"/>
-        <w:jc w:val="both"/>
-      </w:pPr>
-    </w:p>
-    <w:p>
-      <w:pPr>
-        <w:spacing w:line="360" w:lineRule="auto"/>
-        <w:jc w:val="both"/>
-      </w:pPr>
-    </w:p>
-    <w:p>
-      <w:pPr>
-        <w:spacing w:line="360" w:lineRule="auto"/>
-        <w:jc w:val="both"/>
-      </w:pPr>
-    </w:p>
-    <w:p>
-      <w:pPr>
-        <w:spacing w:line="360" w:lineRule="auto"/>
-        <w:jc w:val="both"/>
-      </w:pPr>
-    </w:p>
-    <w:p>
-      <w:pPr>
-        <w:spacing w:line="360" w:lineRule="auto"/>
-        <w:jc w:val="both"/>
-      </w:pPr>
-    </w:p>
-    <w:p>
-      <w:pPr>
-        <w:spacing w:line="360" w:lineRule="auto"/>
-        <w:jc w:val="both"/>
-      </w:pPr>
-    </w:p>
-    <w:p>
-      <w:pPr>
-        <w:spacing w:line="360" w:lineRule="auto"/>
-        <w:jc w:val="both"/>
-      </w:pPr>
-    </w:p>
-    <w:p>
-      <w:pPr>
-        <w:spacing w:line="360" w:lineRule="auto"/>
-        <w:jc w:val="both"/>
-      </w:pPr>
-    </w:p>
-    <w:p>
-      <w:pPr>
-        <w:spacing w:line="360" w:lineRule="auto"/>
-        <w:jc w:val="both"/>
-      </w:pPr>
-    </w:p>
-    <w:p>
-      <w:pPr>
-        <w:spacing w:line="360" w:lineRule="auto"/>
-        <w:jc w:val="both"/>
-      </w:pPr>
-    </w:p>
-    <w:p>
-      <w:pPr>
-        <w:spacing w:line="360" w:lineRule="auto"/>
-        <w:jc w:val="both"/>
-      </w:pPr>
-    </w:p>
-    <w:p>
-      <w:pPr>
-        <w:spacing w:line="360" w:lineRule="auto"/>
-        <w:jc w:val="both"/>
-      </w:pPr>
-    </w:p>
-    <w:p>
-      <w:pPr>
-        <w:spacing w:line="360" w:lineRule="auto"/>
-        <w:jc w:val="both"/>
-      </w:pPr>
-    </w:p>
-    <w:p>
-      <w:pPr>
-        <w:spacing w:line="360" w:lineRule="auto"/>
-        <w:jc w:val="both"/>
-      </w:pPr>
-    </w:p>
-    <w:p>
-      <w:pPr>
-        <w:pStyle w:val="Ttulo2"/>
-      </w:pPr>
-      <w:r>
-        <w:t>        </w:t>
-      </w:r>
-      <w:bookmarkStart w:id="7" w:name="_Toc227570279"/>
-      <w:r>
-        <w:t>4.4</w:t>
-      </w:r>
-      <w:r>
-        <w:t>LIMITES E EXCLUSÕES</w:t>
-      </w:r>
-      <w:bookmarkEnd w:id="7"/>
-      <w:r>
-        <w:t> </w:t>
-      </w:r>
-    </w:p>
-    <w:p>
-      <w:pPr>
-        <w:spacing w:line="360" w:lineRule="auto"/>
-        <w:jc w:val="both"/>
-      </w:pPr>
-      <w:r>
-        <w:tab/>
-        <w:t>Embora o projeto busque ser abrangente, ele possui limites claros, não contemplando funcionalidades de e-commerce ou venda direta de produtos nesta fase inicial. Também estão excluídos o suporte para streaming de vídeo em tempo real e a hospedagem de arquivos pesados em servidores próprios, optando-se por provedores externos para tal fim. A plataforma será disponibilizada inicialmente apenas em português e inglês, não prevendo traduções para outros idiomas ou suporte para funcionalidades complexas de redes sociais externas além das integrações básicas de compartilhamento. </w:t>
-      </w:r>
-    </w:p>
-    <w:p>
-      <w:pPr>
-        <w:spacing w:line="360" w:lineRule="auto"/>
-        <w:jc w:val="both"/>
-      </w:pPr>
-      <w:r>
-        <w:t>      </w:t>
-      </w:r>
-    </w:p>
-    <w:p>
-      <w:pPr>
-        <w:spacing w:line="360" w:lineRule="auto"/>
-        <w:jc w:val="both"/>
-      </w:pPr>
-    </w:p>
-    <w:p>
-      <w:pPr>
-        <w:spacing w:line="360" w:lineRule="auto"/>
-        <w:jc w:val="both"/>
-      </w:pPr>
-    </w:p>
-    <w:p>
-      <w:pPr>
-        <w:spacing w:line="360" w:lineRule="auto"/>
-        <w:jc w:val="both"/>
-      </w:pPr>
-    </w:p>
-    <w:p>
-      <w:pPr>
-        <w:spacing w:line="360" w:lineRule="auto"/>
-        <w:jc w:val="both"/>
-      </w:pPr>
-    </w:p>
-    <w:p>
-      <w:pPr>
-        <w:spacing w:line="360" w:lineRule="auto"/>
-        <w:jc w:val="both"/>
-      </w:pPr>
-    </w:p>
-    <w:p>
-      <w:pPr>
-        <w:spacing w:line="360" w:lineRule="auto"/>
-        <w:jc w:val="both"/>
-      </w:pPr>
-    </w:p>
-    <w:p>
-      <w:pPr>
-        <w:spacing w:line="360" w:lineRule="auto"/>
-        <w:jc w:val="both"/>
-      </w:pPr>
-    </w:p>
-    <w:p>
-      <w:pPr>
-        <w:spacing w:line="360" w:lineRule="auto"/>
-        <w:jc w:val="both"/>
-      </w:pPr>
-    </w:p>
-    <w:p>
-      <w:pPr>
-        <w:spacing w:line="360" w:lineRule="auto"/>
-        <w:jc w:val="both"/>
-      </w:pPr>
-    </w:p>
-    <w:p>
-      <w:pPr>
-        <w:spacing w:line="360" w:lineRule="auto"/>
-        <w:jc w:val="both"/>
-      </w:pPr>
-    </w:p>
-    <w:p>
-      <w:pPr>
-        <w:spacing w:line="360" w:lineRule="auto"/>
-        <w:jc w:val="both"/>
-      </w:pPr>
-    </w:p>
-    <w:p>
-      <w:pPr>
-        <w:spacing w:line="360" w:lineRule="auto"/>
-        <w:jc w:val="both"/>
-      </w:pPr>
-    </w:p>
-    <w:p>
-      <w:pPr>
-        <w:spacing w:line="360" w:lineRule="auto"/>
-        <w:jc w:val="both"/>
-      </w:pPr>
-    </w:p>
-    <w:p>
-      <w:pPr>
-        <w:spacing w:line="360" w:lineRule="auto"/>
-        <w:jc w:val="both"/>
-      </w:pPr>
-    </w:p>
-    <w:p>
-      <w:pPr>
-        <w:spacing w:line="360" w:lineRule="auto"/>
-        <w:jc w:val="both"/>
-      </w:pPr>
-      <w:r>
-        <w:t>   </w:t>
-      </w:r>
-    </w:p>
-    <w:p>
-      <w:pPr>
-        <w:spacing w:line="360" w:lineRule="auto"/>
-        <w:jc w:val="both"/>
-      </w:pPr>
-    </w:p>
-    <w:p>
-      <w:pPr>
-        <w:pStyle w:val="Ttulo2"/>
-      </w:pPr>
-      <w:bookmarkStart w:id="8" w:name="_Toc227570280"/>
-      <w:r>
-        <w:t>4.5</w:t>
-      </w:r>
-      <w:r>
-        <w:t>MACRO CRONOGRAMA</w:t>
-      </w:r>
-      <w:bookmarkEnd w:id="8"/>
-      <w:r>
-        <w:t> </w:t>
-      </w:r>
-    </w:p>
-    <w:p>
-      <w:pPr>
-        <w:spacing w:line="360" w:lineRule="auto"/>
-        <w:jc w:val="both"/>
-      </w:pPr>
-      <w:r>
-        <w:t>       </w:t>
-      </w:r>
-    </w:p>
-    <w:p>
-      <w:pPr>
-        <w:spacing w:line="360" w:lineRule="auto"/>
-        <w:jc w:val="both"/>
-      </w:pPr>
-    </w:p>
-    <w:p>
-      <w:pPr>
-        <w:spacing w:line="360" w:lineRule="auto"/>
-        <w:jc w:val="both"/>
-      </w:pPr>
-    </w:p>
-    <w:p>
-      <w:pPr>
-        <w:spacing w:line="360" w:lineRule="auto"/>
-        <w:jc w:val="both"/>
-      </w:pPr>
-    </w:p>
-    <w:p>
-      <w:pPr>
-        <w:spacing w:line="360" w:lineRule="auto"/>
-        <w:jc w:val="both"/>
-      </w:pPr>
-    </w:p>
-    <w:p>
-      <w:pPr>
-        <w:spacing w:line="360" w:lineRule="auto"/>
-        <w:jc w:val="both"/>
-      </w:pPr>
-    </w:p>
-    <w:p>
-      <w:pPr>
-        <w:spacing w:line="360" w:lineRule="auto"/>
-        <w:jc w:val="both"/>
-      </w:pPr>
-    </w:p>
-    <w:p>
-      <w:pPr>
-        <w:spacing w:line="360" w:lineRule="auto"/>
-        <w:jc w:val="both"/>
-      </w:pPr>
-    </w:p>
-    <w:p>
-      <w:pPr>
-        <w:spacing w:line="360" w:lineRule="auto"/>
-        <w:jc w:val="both"/>
-      </w:pPr>
-    </w:p>
-    <w:p>
-      <w:pPr>
-        <w:spacing w:line="360" w:lineRule="auto"/>
-        <w:jc w:val="both"/>
-      </w:pPr>
-    </w:p>
-    <w:p>
-      <w:pPr>
-        <w:spacing w:line="360" w:lineRule="auto"/>
-        <w:jc w:val="both"/>
-      </w:pPr>
-    </w:p>
-    <w:p>
-      <w:pPr>
-        <w:spacing w:line="360" w:lineRule="auto"/>
-        <w:jc w:val="both"/>
-      </w:pPr>
-    </w:p>
-    <w:p>
-      <w:pPr>
-        <w:spacing w:line="360" w:lineRule="auto"/>
-        <w:jc w:val="both"/>
-      </w:pPr>
-    </w:p>
-    <w:p>
-      <w:pPr>
-        <w:spacing w:line="360" w:lineRule="auto"/>
-        <w:jc w:val="both"/>
-      </w:pPr>
-    </w:p>
-    <w:p>
-      <w:pPr>
-        <w:spacing w:line="360" w:lineRule="auto"/>
-        <w:jc w:val="both"/>
-      </w:pPr>
-    </w:p>
-    <w:p>
-      <w:pPr>
-        <w:spacing w:line="360" w:lineRule="auto"/>
-        <w:jc w:val="both"/>
-      </w:pPr>
-    </w:p>
-    <w:p>
-      <w:pPr>
-        <w:spacing w:line="360" w:lineRule="auto"/>
-        <w:jc w:val="both"/>
-      </w:pPr>
-    </w:p>
-    <w:p>
-      <w:pPr>
-        <w:spacing w:line="360" w:lineRule="auto"/>
-        <w:jc w:val="both"/>
-      </w:pPr>
-    </w:p>
-    <w:p>
-      <w:pPr>
-        <w:spacing w:line="360" w:lineRule="auto"/>
-        <w:jc w:val="both"/>
-      </w:pPr>
-    </w:p>
-    <w:p>
-      <w:pPr>
-        <w:spacing w:line="360" w:lineRule="auto"/>
-        <w:jc w:val="both"/>
-      </w:pPr>
-    </w:p>
-    <w:p>
-      <w:pPr>
-        <w:spacing w:line="360" w:lineRule="auto"/>
-        <w:jc w:val="both"/>
-      </w:pPr>
-    </w:p>
-    <w:p>
-      <w:pPr>
-        <w:spacing w:line="360" w:lineRule="auto"/>
-        <w:jc w:val="both"/>
-      </w:pPr>
-    </w:p>
-    <w:p>
-      <w:pPr>
-        <w:spacing w:line="360" w:lineRule="auto"/>
-        <w:jc w:val="both"/>
-      </w:pPr>
-      <w:r>
-        <w:lastRenderedPageBreak/>
-        <w:t>  </w:t>
-      </w:r>
-    </w:p>
-    <w:p>
-      <w:pPr>
-        <w:pStyle w:val="Ttulo2"/>
-      </w:pPr>
-      <w:bookmarkStart w:id="9" w:name="_Toc227570281"/>
-      <w:r>
-        <w:t>4.6</w:t>
-      </w:r>
-      <w:r>
-        <w:t>RECURSOS</w:t>
-      </w:r>
-      <w:bookmarkEnd w:id="9"/>
-      <w:r>
-        <w:t> </w:t>
-      </w:r>
-    </w:p>
-    <w:p>
-      <w:pPr>
-        <w:spacing w:line="360" w:lineRule="auto"/>
-        <w:jc w:val="both"/>
-      </w:pPr>
-      <w:r>
-        <w:tab/>
-        <w:t>Para a execução do projeto, os recursos humanos serão centralizados no autor, atuando como desenvolvedor Full Stack em todas as frentes. No âmbito tecnológico, serão utilizados frameworks de ponta, como </w:t>
+      <w:r>
+        <w:t>Riscos do projeto:</w:t>
+      </w:r>
+    </w:p>
+    <w:p>
+      <w:r>
+        <w:t xml:space="preserve">O projeto </w:t>
+      </w:r>
+      <w:r>
+        <w:t>S</w:t>
+      </w:r>
+      <w:r>
+        <w:t>kate.log está sujeito a im</w:t>
+      </w:r>
+      <w:r>
+        <w:t>pactos e riscos, como o sistema lida com dados sensíveis um risco que pode ocorrer é a falha na implementação dos protocolos de segurança, assim, ocorrendo o vazamento desses dados</w:t>
+      </w:r>
+      <w:r>
+        <w:t xml:space="preserve">, no quesito técnico, falhas no </w:t>
       </w:r>
       <w:proofErr w:type="spellStart"/>
       <w:r>
-        <w:t>React</w:t>
+        <w:t>backend</w:t>
       </w:r>
       <w:proofErr w:type="spellEnd"/>
       <w:r>
-        <w:t> ou Next.js, além de bancos de dados modernos como PostgreSQL e ferramentas de design como o </w:t>
-      </w:r>
-      <w:proofErr w:type="spellStart"/>
-      <w:r>
-        <w:t>Figma</w:t>
-      </w:r>
-      <w:proofErr w:type="spellEnd"/>
-      <w:r>
-        <w:t>. A infraestrutura de hospedagem será baseada em serviços de nuvem como </w:t>
-      </w:r>
-      <w:proofErr w:type="spellStart"/>
-      <w:r>
-        <w:t>Vercel</w:t>
-      </w:r>
-      <w:proofErr w:type="spellEnd"/>
-      <w:r>
-        <w:t> ou AWS, priorizando soluções que ofereçam escalabilidade e estabilidade para o </w:t>
-      </w:r>
-      <w:proofErr w:type="gramStart"/>
-      <w:r>
-        <w:t>produto final</w:t>
-      </w:r>
-      <w:proofErr w:type="gramEnd"/>
-      <w:r>
-        <w:t>. </w:t>
-      </w:r>
-    </w:p>
-    <w:p>
-      <w:pPr>
-        <w:spacing w:line="360" w:lineRule="auto"/>
-        <w:jc w:val="both"/>
-      </w:pPr>
-      <w:r>
-        <w:t>    </w:t>
-      </w:r>
-    </w:p>
-    <w:p>
-      <w:pPr>
-        <w:spacing w:line="360" w:lineRule="auto"/>
-        <w:jc w:val="both"/>
-      </w:pPr>
-    </w:p>
-    <w:p>
-      <w:pPr>
-        <w:spacing w:line="360" w:lineRule="auto"/>
-        <w:jc w:val="both"/>
-      </w:pPr>
-    </w:p>
-    <w:p>
-      <w:pPr>
-        <w:spacing w:line="360" w:lineRule="auto"/>
-        <w:jc w:val="both"/>
-      </w:pPr>
-    </w:p>
-    <w:p>
-      <w:pPr>
-        <w:spacing w:line="360" w:lineRule="auto"/>
-        <w:jc w:val="both"/>
-      </w:pPr>
-    </w:p>
-    <w:p>
-      <w:pPr>
-        <w:spacing w:line="360" w:lineRule="auto"/>
-        <w:jc w:val="both"/>
-      </w:pPr>
-    </w:p>
-    <w:p>
-      <w:pPr>
-        <w:spacing w:line="360" w:lineRule="auto"/>
-        <w:jc w:val="both"/>
-      </w:pPr>
-    </w:p>
-    <w:p>
-      <w:pPr>
-        <w:spacing w:line="360" w:lineRule="auto"/>
-        <w:jc w:val="both"/>
-      </w:pPr>
-    </w:p>
-    <w:p>
-      <w:pPr>
-        <w:spacing w:line="360" w:lineRule="auto"/>
-        <w:jc w:val="both"/>
-      </w:pPr>
-    </w:p>
-    <w:p>
-      <w:pPr>
-        <w:spacing w:line="360" w:lineRule="auto"/>
-        <w:jc w:val="both"/>
-      </w:pPr>
-    </w:p>
-    <w:p>
-      <w:pPr>
-        <w:spacing w:line="360" w:lineRule="auto"/>
-        <w:jc w:val="both"/>
-      </w:pPr>
-    </w:p>
-    <w:p>
-      <w:pPr>
-        <w:spacing w:line="360" w:lineRule="auto"/>
-        <w:jc w:val="both"/>
-      </w:pPr>
-    </w:p>
-    <w:p>
-      <w:pPr>
-        <w:spacing w:line="360" w:lineRule="auto"/>
-        <w:jc w:val="both"/>
-      </w:pPr>
-    </w:p>
-    <w:p>
-      <w:pPr>
-        <w:spacing w:line="360" w:lineRule="auto"/>
-        <w:jc w:val="both"/>
-      </w:pPr>
-    </w:p>
-    <w:p>
-      <w:pPr>
-        <w:spacing w:line="360" w:lineRule="auto"/>
-        <w:jc w:val="both"/>
-      </w:pPr>
-    </w:p>
-    <w:p>
-      <w:pPr>
-        <w:spacing w:line="360" w:lineRule="auto"/>
-        <w:jc w:val="both"/>
-      </w:pPr>
-    </w:p>
-    <w:p>
-      <w:pPr>
-        <w:spacing w:line="360" w:lineRule="auto"/>
-        <w:jc w:val="both"/>
-      </w:pPr>
-    </w:p>
-    <w:p>
-      <w:pPr>
-        <w:spacing w:line="360" w:lineRule="auto"/>
-        <w:jc w:val="both"/>
-      </w:pPr>
-    </w:p>
-    <w:p>
-      <w:pPr>
-        <w:pStyle w:val="Ttulo2"/>
-      </w:pPr>
-      <w:r>
-        <w:t>     </w:t>
-      </w:r>
-      <w:bookmarkStart w:id="10" w:name="_Toc227570282"/>
-      <w:r>
-        <w:t>4.7</w:t>
-      </w:r>
-      <w:r>
-        <w:t>RISCOS E RESTRIÇÕES</w:t>
-      </w:r>
-      <w:bookmarkEnd w:id="10"/>
-      <w:r>
-        <w:t> </w:t>
+        <w:t xml:space="preserve"> podem comprometer o funcionamento das dashboard, gerando um estresse </w:t>
+      </w:r>
+      <w:r>
+        <w:t>para o</w:t>
+      </w:r>
+      <w:r>
+        <w:t xml:space="preserve"> cliente final</w:t>
+      </w:r>
+      <w:r>
+        <w:t>. Além disso, a curva de aprendizado técnica surge como desafio</w:t>
+      </w:r>
+      <w:r>
+        <w:t>, já que pode causar atrasos no cronograma caso surjam bugs e problemas mais complexos.</w:t>
+      </w:r>
+    </w:p>
+    <w:p/>
+    <w:p>
+      <w:r>
+        <w:t>Restrições do projeto:</w:t>
+      </w:r>
+    </w:p>
+    <w:p>
+      <w:r>
+        <w:t>As restrições para o projeto Skate.log estão marcadas por diretrizes acadêmicas e t</w:t>
+      </w:r>
+      <w:r>
+        <w:t>écnicas. Primeira, o projeto precisa ser entregue dentro do prazo estimado, estabelecido de acordo com o calendário da Faculdade</w:t>
+      </w:r>
+      <w:r>
+        <w:t xml:space="preserve">, limitando a extensão do escopo para implementação de itens mais complexos. Na visão técnica o projeto está restrito </w:t>
+      </w:r>
+      <w:r>
+        <w:t>á algumas tecnologias e linguagens de programação definidas pela instituição, como Javascript, HTML, CSS e a API disponibilizada</w:t>
+      </w:r>
+      <w:r>
+        <w:t>, devendo operar em um banco de dados localizado em um ambiente virtual.</w:t>
       </w:r>
     </w:p>
     <w:p>
@@ -3036,87 +3226,10 @@
     </w:p>
     <w:p>
       <w:pPr>
-        <w:spacing w:line="360" w:lineRule="auto"/>
-        <w:jc w:val="both"/>
-      </w:pPr>
-    </w:p>
-    <w:p>
-      <w:pPr>
-        <w:spacing w:line="360" w:lineRule="auto"/>
-        <w:jc w:val="both"/>
-      </w:pPr>
-    </w:p>
-    <w:p>
-      <w:pPr>
-        <w:spacing w:line="360" w:lineRule="auto"/>
-        <w:jc w:val="both"/>
-      </w:pPr>
-    </w:p>
-    <w:p>
-      <w:pPr>
-        <w:spacing w:line="360" w:lineRule="auto"/>
-        <w:jc w:val="both"/>
-      </w:pPr>
-    </w:p>
-    <w:p>
-      <w:pPr>
-        <w:spacing w:line="360" w:lineRule="auto"/>
-        <w:jc w:val="both"/>
-      </w:pPr>
-    </w:p>
-    <w:p>
-      <w:pPr>
-        <w:spacing w:line="360" w:lineRule="auto"/>
-        <w:jc w:val="both"/>
-      </w:pPr>
-    </w:p>
-    <w:p>
-      <w:pPr>
-        <w:spacing w:line="360" w:lineRule="auto"/>
-        <w:jc w:val="both"/>
-      </w:pPr>
-    </w:p>
-    <w:p>
-      <w:pPr>
-        <w:spacing w:line="360" w:lineRule="auto"/>
-        <w:jc w:val="both"/>
-      </w:pPr>
-    </w:p>
-    <w:p>
-      <w:pPr>
-        <w:spacing w:line="360" w:lineRule="auto"/>
-        <w:jc w:val="both"/>
-      </w:pPr>
-    </w:p>
-    <w:p>
-      <w:pPr>
-        <w:spacing w:line="360" w:lineRule="auto"/>
-        <w:jc w:val="both"/>
-      </w:pPr>
-    </w:p>
-    <w:p>
-      <w:pPr>
-        <w:spacing w:line="360" w:lineRule="auto"/>
-        <w:jc w:val="both"/>
-      </w:pPr>
-    </w:p>
-    <w:p>
-      <w:pPr>
-        <w:spacing w:line="360" w:lineRule="auto"/>
-        <w:jc w:val="both"/>
-      </w:pPr>
-    </w:p>
-    <w:p>
-      <w:pPr>
-        <w:spacing w:line="360" w:lineRule="auto"/>
-        <w:jc w:val="both"/>
-      </w:pPr>
-    </w:p>
-    <w:p>
-      <w:pPr>
         <w:pStyle w:val="Ttulo2"/>
       </w:pPr>
       <w:r>
+        <w:lastRenderedPageBreak/>
         <w:t> </w:t>
       </w:r>
       <w:bookmarkStart w:id="11" w:name="_Toc227570283"/>
@@ -3138,7 +3251,19 @@
       </w:pPr>
       <w:r>
         <w:tab/>
-        <w:t>Os stakeholders do projeto dividem-se em três níveis de interesse e impacto. O stakeholder primário é o próprio desenvolvedor, sendo o principal interessado no sucesso técnico e pessoal do produto. Em segundo plano estão os usuários entusiastas e a comunidade urbana de skate, que usufruirão do conteúdo e das ferramentas de evolução. Por fim, os stakeholders terciários incluem recrutadores e avaliadores técnicos, para quem o projeto servirá como uma vitrine de habilidades técnicas, visão de mercado e capacidade de traduzir conceitos complexos em soluções digitais eficientes. </w:t>
+        <w:t xml:space="preserve">Os stakeholders do projeto dividem-se em três níveis de interesse e impacto. O stakeholder primário é o próprio desenvolvedor, sendo o principal interessado no sucesso técnico e pessoal do produto. Em segundo plano estão os usuários entusiastas e a comunidade urbana de skate, que usufruirão do conteúdo e das ferramentas de evolução. Por fim, os stakeholders terciários incluem recrutadores e avaliadores técnicos, para quem o projeto servirá como uma </w:t>
+      </w:r>
+      <w:r>
+        <w:t xml:space="preserve">certeza das </w:t>
+      </w:r>
+      <w:r>
+        <w:t>habilidades técnicas</w:t>
+      </w:r>
+      <w:r>
+        <w:t xml:space="preserve"> aprendidas durante os primeiros 5 meses de ensino na instituição</w:t>
+      </w:r>
+      <w:r>
+        <w:t>. </w:t>
       </w:r>
     </w:p>
     <w:p>
@@ -3270,6 +3395,7 @@
       </w:pPr>
       <w:bookmarkStart w:id="12" w:name="_Toc227570284"/>
       <w:r>
+        <w:lastRenderedPageBreak/>
         <w:t>5.</w:t>
       </w:r>
       <w:r>
@@ -3286,6 +3412,9 @@
         <w:jc w:val="both"/>
       </w:pPr>
       <w:r>
+        <w:rPr>
+          <w:noProof/>
+        </w:rPr>
         <w:drawing>
           <wp:inline distT="0" distB="0" distL="0" distR="0" wp14:anchorId="34EDD518" wp14:editId="15989FD4">
             <wp:extent cx="5722620" cy="2811780"/>
@@ -3435,6 +3564,7 @@
       </w:pPr>
       <w:bookmarkStart w:id="13" w:name="_Toc227570285"/>
       <w:r>
+        <w:lastRenderedPageBreak/>
         <w:t>6.</w:t>
       </w:r>
       <w:r>
@@ -3451,7 +3581,41 @@
         <w:jc w:val="both"/>
       </w:pPr>
       <w:r>
-        <w:t>As diretrizes operacionais deste projeto baseiam-se na premissa de que haverá disponibilidade contínua das ferramentas de desenvolvimento e estabilidade nas APIs de terceiros, garantindo que o fluxo de trabalho não sofra interrupções externas críticas. Assume-se que o desenvolvedor manterá uma dedicação constante ao cronograma e que o acesso aos serviços de hospedagem em nuvem permanecerá ininterrupto, validando a relevância do conteúdo para uma comunidade de skate que se presume ativa e engajada. No entanto, o sucesso desta execução está condicionado a restrições rigorosas, como a ausência de orçamento para serviços premium, o que limita o projeto ao uso exclusivo de tecnologias de código aberto e camadas gratuitas de infraestrutura. Além disso, o desenvolvimento deve respeitar o limite temporal do semestre letivo de 2026 e a capacidade produtiva de um único desenvolvedor, exigindo uma gestão de prioridades severa para assegurar que a performance e a segurança do sistema sejam mantidas dentro dos padrões técnicos estabelecidos, mesmo diante das limitações de uma equipe reduzida. </w:t>
+        <w:t xml:space="preserve">As diretrizes operacionais deste projeto baseiam-se na premissa de que haverá disponibilidade contínua das ferramentas de desenvolvimento e estabilidade nas APIs de </w:t>
+      </w:r>
+      <w:r>
+        <w:t>terceiros</w:t>
+      </w:r>
+      <w:r>
+        <w:t xml:space="preserve"> (</w:t>
+      </w:r>
+      <w:r>
+        <w:t>Web Data-</w:t>
+      </w:r>
+      <w:proofErr w:type="spellStart"/>
+      <w:r>
+        <w:t>Viz</w:t>
+      </w:r>
+      <w:proofErr w:type="spellEnd"/>
+      <w:r>
+        <w:t xml:space="preserve"> - </w:t>
+      </w:r>
+      <w:proofErr w:type="spellStart"/>
+      <w:r>
+        <w:t>SpTech</w:t>
+      </w:r>
+      <w:proofErr w:type="spellEnd"/>
+      <w:r>
+        <w:t>)</w:t>
+      </w:r>
+      <w:r>
+        <w:t>, garantindo que o fluxo de trabalho não sofra interrupções externas críticas. Assume-se que o desenvolvedor manterá uma dedicação constante ao cronograma</w:t>
+      </w:r>
+      <w:r>
+        <w:t xml:space="preserve">, </w:t>
+      </w:r>
+      <w:r>
+        <w:t>validando a relevância do conteúdo para uma comunidade de skate que se presume ativa e engajada. No entanto, o sucesso desta execução está condicionado a restrições rigorosas, como a ausência de orçamento para serviços premium, o que limita o projeto ao uso exclusivo de tecnologias de código aberto e camadas gratuitas de infraestrutura. Além disso, o desenvolvimento deve respeitar o limite temporal do semestre letivo de 2026 e a capacidade produtiva de um único desenvolvedor, exigindo uma gestão de prioridades severa para assegurar que a performance e a segurança do sistema sejam mantidas dentro dos padrões técnicos estabelecidos, mesmo diante das limitações de uma equipe reduzida. </w:t>
       </w:r>
     </w:p>
     <w:p>
@@ -3468,11 +3632,6 @@
         <w:spacing w:line="360" w:lineRule="auto"/>
         <w:jc w:val="both"/>
       </w:pPr>
-      <w:r>
-        <w:t> </w:t>
-      </w:r>
-    </w:p>
-    <w:p>
       <w:r>
         <w:t> </w:t>
       </w:r>

</xml_diff>